<commit_message>
done screen flow .drawio
</commit_message>
<xml_diff>
--- a/Document/02_Requirements/HCMS_SRS_v0.1.docx
+++ b/Document/02_Requirements/HCMS_SRS_v0.1.docx
@@ -5412,6 +5412,7 @@
       <w:r>
         <w:rPr>
           <w:i/>
+          <w:noProof/>
         </w:rPr>
         <w:drawing>
           <wp:inline distT="0" distB="0" distL="0" distR="0" wp14:anchorId="1D530C54" wp14:editId="5E7DFB83">
@@ -5488,6 +5489,7 @@
       <w:r>
         <w:rPr>
           <w:i/>
+          <w:noProof/>
         </w:rPr>
         <w:drawing>
           <wp:inline distT="0" distB="0" distL="0" distR="0" wp14:anchorId="4F4B7E1C" wp14:editId="0AC5DBBC">
@@ -5540,17 +5542,14 @@
         <w:t>.2.3</w:t>
       </w:r>
       <w:r>
-        <w:t xml:space="preserve"> </w:t>
-      </w:r>
-      <w:r>
-        <w:t xml:space="preserve">UCs for </w:t>
-      </w:r>
-      <w:r>
-        <w:t>Doctors</w:t>
+        <w:t xml:space="preserve"> UCs for Doctors</w:t>
       </w:r>
     </w:p>
     <w:p>
       <w:r>
+        <w:rPr>
+          <w:noProof/>
+        </w:rPr>
         <w:drawing>
           <wp:inline distT="0" distB="0" distL="0" distR="0" wp14:anchorId="5216246C" wp14:editId="7F6D5F4C">
             <wp:extent cx="5746750" cy="3382010"/>
@@ -5613,25 +5612,74 @@
         <w:jc w:val="center"/>
       </w:pPr>
       <w:r>
-        <w:rPr>
-          <w:noProof/>
-        </w:rPr>
         <w:drawing>
-          <wp:inline distT="0" distB="0" distL="0" distR="0" wp14:anchorId="6BC7E3FB" wp14:editId="6E821116">
-            <wp:extent cx="5763629" cy="2462474"/>
-            <wp:effectExtent l="0" t="0" r="0" b="0"/>
-            <wp:docPr id="29" name="image10.png"/>
-            <wp:cNvGraphicFramePr/>
+          <wp:inline distT="0" distB="0" distL="0" distR="0" wp14:anchorId="6750E613" wp14:editId="1F62B073">
+            <wp:extent cx="6098098" cy="1578634"/>
+            <wp:effectExtent l="0" t="0" r="0" b="2540"/>
+            <wp:docPr id="1425770865" name="Picture 1"/>
+            <wp:cNvGraphicFramePr>
+              <a:graphicFrameLocks xmlns:a="http://schemas.openxmlformats.org/drawingml/2006/main" noChangeAspect="1"/>
+            </wp:cNvGraphicFramePr>
             <a:graphic xmlns:a="http://schemas.openxmlformats.org/drawingml/2006/main">
               <a:graphicData uri="http://schemas.openxmlformats.org/drawingml/2006/picture">
                 <pic:pic xmlns:pic="http://schemas.openxmlformats.org/drawingml/2006/picture">
                   <pic:nvPicPr>
-                    <pic:cNvPr id="0" name="image10.png"/>
-                    <pic:cNvPicPr preferRelativeResize="0"/>
+                    <pic:cNvPr id="1425770865" name=""/>
+                    <pic:cNvPicPr/>
+                  </pic:nvPicPr>
+                  <pic:blipFill rotWithShape="1">
+                    <a:blip r:embed="rId16"/>
+                    <a:srcRect l="2253" t="-1" r="4379" b="5756"/>
+                    <a:stretch>
+                      <a:fillRect/>
+                    </a:stretch>
+                  </pic:blipFill>
+                  <pic:spPr bwMode="auto">
+                    <a:xfrm>
+                      <a:off x="0" y="0"/>
+                      <a:ext cx="6112297" cy="1582310"/>
+                    </a:xfrm>
+                    <a:prstGeom prst="rect">
+                      <a:avLst/>
+                    </a:prstGeom>
+                    <a:ln>
+                      <a:noFill/>
+                    </a:ln>
+                    <a:extLst>
+                      <a:ext uri="{53640926-AAD7-44D8-BBD7-CCE9431645EC}">
+                        <a14:shadowObscured xmlns:a14="http://schemas.microsoft.com/office/drawing/2010/main"/>
+                      </a:ext>
+                    </a:extLst>
+                  </pic:spPr>
+                </pic:pic>
+              </a:graphicData>
+            </a:graphic>
+          </wp:inline>
+        </w:drawing>
+      </w:r>
+    </w:p>
+    <w:p>
+      <w:pPr>
+        <w:jc w:val="center"/>
+      </w:pPr>
+      <w:r>
+        <w:drawing>
+          <wp:inline distT="0" distB="0" distL="0" distR="0" wp14:anchorId="3FFCE791" wp14:editId="3625525B">
+            <wp:extent cx="5961825" cy="3001993"/>
+            <wp:effectExtent l="0" t="0" r="1270" b="8255"/>
+            <wp:docPr id="2054810808" name="Picture 1"/>
+            <wp:cNvGraphicFramePr>
+              <a:graphicFrameLocks xmlns:a="http://schemas.openxmlformats.org/drawingml/2006/main" noChangeAspect="1"/>
+            </wp:cNvGraphicFramePr>
+            <a:graphic xmlns:a="http://schemas.openxmlformats.org/drawingml/2006/main">
+              <a:graphicData uri="http://schemas.openxmlformats.org/drawingml/2006/picture">
+                <pic:pic xmlns:pic="http://schemas.openxmlformats.org/drawingml/2006/picture">
+                  <pic:nvPicPr>
+                    <pic:cNvPr id="2054810808" name=""/>
+                    <pic:cNvPicPr/>
                   </pic:nvPicPr>
                   <pic:blipFill>
-                    <a:blip r:embed="rId16"/>
-                    <a:srcRect/>
+                    <a:blip r:embed="rId17"/>
                     <a:stretch>
                       <a:fillRect/>
                     </a:stretch>
@@ -5639,12 +5687,53 @@
                   <pic:spPr>
                     <a:xfrm>
                       <a:off x="0" y="0"/>
-                      <a:ext cx="5763629" cy="2462474"/>
+                      <a:ext cx="5964822" cy="3003502"/>
                     </a:xfrm>
                     <a:prstGeom prst="rect">
                       <a:avLst/>
                     </a:prstGeom>
-                    <a:ln/>
+                  </pic:spPr>
+                </pic:pic>
+              </a:graphicData>
+            </a:graphic>
+          </wp:inline>
+        </w:drawing>
+      </w:r>
+    </w:p>
+    <w:p>
+      <w:pPr>
+        <w:jc w:val="center"/>
+      </w:pPr>
+      <w:r>
+        <w:drawing>
+          <wp:inline distT="0" distB="0" distL="0" distR="0" wp14:anchorId="6D5CEC33" wp14:editId="2E946351">
+            <wp:extent cx="5911081" cy="2622430"/>
+            <wp:effectExtent l="0" t="0" r="0" b="6985"/>
+            <wp:docPr id="1079355304" name="Picture 1"/>
+            <wp:cNvGraphicFramePr>
+              <a:graphicFrameLocks xmlns:a="http://schemas.openxmlformats.org/drawingml/2006/main" noChangeAspect="1"/>
+            </wp:cNvGraphicFramePr>
+            <a:graphic xmlns:a="http://schemas.openxmlformats.org/drawingml/2006/main">
+              <a:graphicData uri="http://schemas.openxmlformats.org/drawingml/2006/picture">
+                <pic:pic xmlns:pic="http://schemas.openxmlformats.org/drawingml/2006/picture">
+                  <pic:nvPicPr>
+                    <pic:cNvPr id="1079355304" name=""/>
+                    <pic:cNvPicPr/>
+                  </pic:nvPicPr>
+                  <pic:blipFill>
+                    <a:blip r:embed="rId18"/>
+                    <a:stretch>
+                      <a:fillRect/>
+                    </a:stretch>
+                  </pic:blipFill>
+                  <pic:spPr>
+                    <a:xfrm>
+                      <a:off x="0" y="0"/>
+                      <a:ext cx="5915906" cy="2624570"/>
+                    </a:xfrm>
+                    <a:prstGeom prst="rect">
+                      <a:avLst/>
+                    </a:prstGeom>
                   </pic:spPr>
                 </pic:pic>
               </a:graphicData>
@@ -5915,6 +6004,7 @@
               <w:rPr>
                 <w:color w:val="000000"/>
               </w:rPr>
+              <w:lastRenderedPageBreak/>
               <w:t>&lt;&lt;Screen Name2&gt;&gt;</w:t>
             </w:r>
           </w:p>
@@ -6356,50 +6446,6 @@
     </w:p>
     <w:p>
       <w:pPr>
-        <w:rPr>
-          <w:i/>
-          <w:color w:val="0000FF"/>
-        </w:rPr>
-      </w:pPr>
-      <w:r>
-        <w:rPr>
-          <w:i/>
-          <w:color w:val="0000FF"/>
-        </w:rPr>
-        <w:t xml:space="preserve">[Provide the </w:t>
-      </w:r>
-      <w:r>
-        <w:rPr>
-          <w:b/>
-          <w:i/>
-          <w:color w:val="0000FF"/>
-        </w:rPr>
-        <w:t>ERD</w:t>
-      </w:r>
-      <w:r>
-        <w:rPr>
-          <w:i/>
-          <w:color w:val="0000FF"/>
-        </w:rPr>
-        <w:t xml:space="preserve"> </w:t>
-      </w:r>
-      <w:r>
-        <w:rPr>
-          <w:i/>
-          <w:color w:val="0000FF"/>
-        </w:rPr>
-        <w:t xml:space="preserve">using the Crow-Foot notation </w:t>
-      </w:r>
-      <w:r>
-        <w:rPr>
-          <w:i/>
-          <w:color w:val="0000FF"/>
-        </w:rPr>
-        <w:t>and the entity descriptions as below]</w:t>
-      </w:r>
-    </w:p>
-    <w:p>
-      <w:pPr>
         <w:jc w:val="center"/>
       </w:pPr>
       <w:r>
@@ -6420,7 +6466,7 @@
                     <pic:cNvPicPr preferRelativeResize="0"/>
                   </pic:nvPicPr>
                   <pic:blipFill>
-                    <a:blip r:embed="rId17"/>
+                    <a:blip r:embed="rId19"/>
                     <a:srcRect/>
                     <a:stretch>
                       <a:fillRect/>
@@ -6455,7 +6501,6 @@
           <w:b/>
           <w:u w:val="single"/>
         </w:rPr>
-        <w:lastRenderedPageBreak/>
         <w:t xml:space="preserve">Entities </w:t>
       </w:r>
       <w:r>
@@ -7018,6 +7063,7 @@
               <w:jc w:val="right"/>
             </w:pPr>
             <w:r>
+              <w:lastRenderedPageBreak/>
               <w:t xml:space="preserve">Alternative </w:t>
             </w:r>
             <w:r>
@@ -7260,7 +7306,6 @@
         <w:ind w:left="567" w:hanging="283"/>
       </w:pPr>
       <w:r>
-        <w:lastRenderedPageBreak/>
         <w:t>Any anticipated error conditions that could occur during execution of the use case and how the system is to respond to those conditions.</w:t>
       </w:r>
     </w:p>
@@ -7800,6 +7845,7 @@
               <w:jc w:val="right"/>
             </w:pPr>
             <w:r>
+              <w:lastRenderedPageBreak/>
               <w:t>Alternative Sequences/Flows</w:t>
             </w:r>
           </w:p>
@@ -9233,7 +9279,7 @@
                     <pic:cNvPicPr preferRelativeResize="0"/>
                   </pic:nvPicPr>
                   <pic:blipFill>
-                    <a:blip r:embed="rId18"/>
+                    <a:blip r:embed="rId20"/>
                     <a:srcRect/>
                     <a:stretch>
                       <a:fillRect/>
@@ -9564,7 +9610,7 @@
                     <pic:cNvPicPr preferRelativeResize="0"/>
                   </pic:nvPicPr>
                   <pic:blipFill>
-                    <a:blip r:embed="rId19"/>
+                    <a:blip r:embed="rId21"/>
                     <a:srcRect/>
                     <a:stretch>
                       <a:fillRect/>
@@ -12203,7 +12249,7 @@
       <w:bookmarkEnd w:id="46"/>
     </w:p>
     <w:sectPr>
-      <w:footerReference w:type="default" r:id="rId20"/>
+      <w:footerReference w:type="default" r:id="rId22"/>
       <w:pgSz w:w="11906" w:h="16838"/>
       <w:pgMar w:top="1440" w:right="1416" w:bottom="1440" w:left="1440" w:header="708" w:footer="708" w:gutter="0"/>
       <w:pgNumType w:start="1"/>

</xml_diff>

<commit_message>
done ERD Logical Diagram
</commit_message>
<xml_diff>
--- a/Document/02_Requirements/HCMS_SRS_v0.1.docx
+++ b/Document/02_Requirements/HCMS_SRS_v0.1.docx
@@ -3507,28 +3507,12 @@
         <w:lastRenderedPageBreak/>
         <w:t xml:space="preserve">1.2.3 </w:t>
       </w:r>
-      <w:proofErr w:type="spellStart"/>
       <w:r>
         <w:rPr>
           <w:lang w:val="vi-VN"/>
         </w:rPr>
-        <w:t>Streamlined</w:t>
-      </w:r>
-      <w:proofErr w:type="spellEnd"/>
-      <w:r>
-        <w:rPr>
-          <w:lang w:val="vi-VN"/>
-        </w:rPr>
-        <w:t xml:space="preserve"> 1-Click </w:t>
-      </w:r>
-      <w:proofErr w:type="spellStart"/>
-      <w:r>
-        <w:rPr>
-          <w:lang w:val="vi-VN"/>
-        </w:rPr>
-        <w:t>Checkout</w:t>
-      </w:r>
-      <w:proofErr w:type="spellEnd"/>
+        <w:t>Streamlined 1-Click Checkout</w:t>
+      </w:r>
     </w:p>
     <w:p>
       <w:r>
@@ -5612,6 +5596,9 @@
         <w:jc w:val="center"/>
       </w:pPr>
       <w:r>
+        <w:rPr>
+          <w:noProof/>
+        </w:rPr>
         <w:drawing>
           <wp:inline distT="0" distB="0" distL="0" distR="0" wp14:anchorId="6750E613" wp14:editId="1F62B073">
             <wp:extent cx="6098098" cy="1578634"/>
@@ -5663,6 +5650,9 @@
         <w:jc w:val="center"/>
       </w:pPr>
       <w:r>
+        <w:rPr>
+          <w:noProof/>
+        </w:rPr>
         <w:drawing>
           <wp:inline distT="0" distB="0" distL="0" distR="0" wp14:anchorId="3FFCE791" wp14:editId="3625525B">
             <wp:extent cx="5961825" cy="3001993"/>
@@ -5705,6 +5695,9 @@
         <w:jc w:val="center"/>
       </w:pPr>
       <w:r>
+        <w:rPr>
+          <w:noProof/>
+        </w:rPr>
         <w:drawing>
           <wp:inline distT="0" distB="0" distL="0" distR="0" wp14:anchorId="6D5CEC33" wp14:editId="2E946351">
             <wp:extent cx="5911081" cy="2622430"/>
@@ -6185,39 +6178,7 @@
           <w:i/>
           <w:color w:val="0000FF"/>
         </w:rPr>
-        <w:t xml:space="preserve">[Provide the descriptions for the non-screen system functions, </w:t>
-      </w:r>
-      <w:proofErr w:type="spellStart"/>
-      <w:r>
-        <w:rPr>
-          <w:i/>
-          <w:color w:val="0000FF"/>
-        </w:rPr>
-        <w:t>i.e</w:t>
-      </w:r>
-      <w:proofErr w:type="spellEnd"/>
-      <w:r>
-        <w:rPr>
-          <w:i/>
-          <w:color w:val="0000FF"/>
-        </w:rPr>
-        <w:t xml:space="preserve"> batch/</w:t>
-      </w:r>
-      <w:proofErr w:type="spellStart"/>
-      <w:r>
-        <w:rPr>
-          <w:i/>
-          <w:color w:val="0000FF"/>
-        </w:rPr>
-        <w:t>cron</w:t>
-      </w:r>
-      <w:proofErr w:type="spellEnd"/>
-      <w:r>
-        <w:rPr>
-          <w:i/>
-          <w:color w:val="0000FF"/>
-        </w:rPr>
-        <w:t xml:space="preserve"> job, service, API, etc.]</w:t>
+        <w:t>[Provide the descriptions for the non-screen system functions, i.e batch/cron job, service, API, etc.]</w:t>
       </w:r>
     </w:p>
     <w:tbl>
@@ -6449,25 +6410,23 @@
         <w:jc w:val="center"/>
       </w:pPr>
       <w:r>
-        <w:rPr>
-          <w:noProof/>
-        </w:rPr>
         <w:drawing>
-          <wp:inline distT="0" distB="0" distL="0" distR="0" wp14:anchorId="0ED67168" wp14:editId="53C9525C">
-            <wp:extent cx="5343525" cy="2371725"/>
-            <wp:effectExtent l="0" t="0" r="9525" b="9525"/>
-            <wp:docPr id="32" name="image12.png"/>
-            <wp:cNvGraphicFramePr/>
+          <wp:inline distT="0" distB="0" distL="0" distR="0" wp14:anchorId="543CF779" wp14:editId="66794E09">
+            <wp:extent cx="5746750" cy="3658235"/>
+            <wp:effectExtent l="0" t="0" r="6350" b="0"/>
+            <wp:docPr id="227748167" name="Picture 1"/>
+            <wp:cNvGraphicFramePr>
+              <a:graphicFrameLocks xmlns:a="http://schemas.openxmlformats.org/drawingml/2006/main" noChangeAspect="1"/>
+            </wp:cNvGraphicFramePr>
             <a:graphic xmlns:a="http://schemas.openxmlformats.org/drawingml/2006/main">
               <a:graphicData uri="http://schemas.openxmlformats.org/drawingml/2006/picture">
                 <pic:pic xmlns:pic="http://schemas.openxmlformats.org/drawingml/2006/picture">
                   <pic:nvPicPr>
-                    <pic:cNvPr id="0" name="image12.png"/>
-                    <pic:cNvPicPr preferRelativeResize="0"/>
+                    <pic:cNvPr id="227748167" name=""/>
+                    <pic:cNvPicPr/>
                   </pic:nvPicPr>
                   <pic:blipFill>
                     <a:blip r:embed="rId19"/>
-                    <a:srcRect/>
                     <a:stretch>
                       <a:fillRect/>
                     </a:stretch>
@@ -6475,12 +6434,11 @@
                   <pic:spPr>
                     <a:xfrm>
                       <a:off x="0" y="0"/>
-                      <a:ext cx="5366353" cy="2381857"/>
+                      <a:ext cx="5746750" cy="3658235"/>
                     </a:xfrm>
                     <a:prstGeom prst="rect">
                       <a:avLst/>
                     </a:prstGeom>
-                    <a:ln/>
                   </pic:spPr>
                 </pic:pic>
               </a:graphicData>
@@ -6833,23 +6791,7 @@
           <w:i/>
           <w:color w:val="0000FF"/>
         </w:rPr>
-        <w:t>. Other UCs (</w:t>
-      </w:r>
-      <w:proofErr w:type="spellStart"/>
-      <w:r>
-        <w:rPr>
-          <w:i/>
-          <w:color w:val="0000FF"/>
-        </w:rPr>
-        <w:t>i.e</w:t>
-      </w:r>
-      <w:proofErr w:type="spellEnd"/>
-      <w:r>
-        <w:rPr>
-          <w:i/>
-          <w:color w:val="0000FF"/>
-        </w:rPr>
-        <w:t xml:space="preserve"> CRUD or data-viewing UCs) are simple, and you just need to refer the descriptions in the Functional Requirement (part 3) below)]</w:t>
+        <w:t>. Other UCs (i.e CRUD or data-viewing UCs) are simple, and you just need to refer the descriptions in the Functional Requirement (part 3) below)]</w:t>
       </w:r>
     </w:p>
     <w:p>
@@ -6858,6 +6800,7 @@
       </w:pPr>
       <w:bookmarkStart w:id="9" w:name="_Toc187341939"/>
       <w:r>
+        <w:lastRenderedPageBreak/>
         <w:t>2.1 &lt;&lt;Feature Name1&gt;&gt;</w:t>
       </w:r>
       <w:bookmarkEnd w:id="9"/>
@@ -7063,7 +7006,6 @@
               <w:jc w:val="right"/>
             </w:pPr>
             <w:r>
-              <w:lastRenderedPageBreak/>
               <w:t xml:space="preserve">Alternative </w:t>
             </w:r>
             <w:r>
@@ -7285,15 +7227,7 @@
         <w:ind w:left="567" w:hanging="283"/>
       </w:pPr>
       <w:r>
-        <w:t xml:space="preserve">Other successful usage scenarios that can take place within this use case. State the alternative </w:t>
-      </w:r>
-      <w:proofErr w:type="gramStart"/>
-      <w:r>
-        <w:t>flow, and</w:t>
-      </w:r>
-      <w:proofErr w:type="gramEnd"/>
-      <w:r>
-        <w:t xml:space="preserve"> describe any differences in the sequence of steps that take place. </w:t>
+        <w:t xml:space="preserve">Other successful usage scenarios that can take place within this use case. State the alternative flow, and describe any differences in the sequence of steps that take place. </w:t>
       </w:r>
     </w:p>
     <w:p>
@@ -7566,6 +7500,7 @@
               <w:jc w:val="right"/>
             </w:pPr>
             <w:r>
+              <w:lastRenderedPageBreak/>
               <w:t>Normal Sequence/Flow</w:t>
             </w:r>
           </w:p>
@@ -7648,21 +7583,7 @@
               <w:rPr>
                 <w:color w:val="000000"/>
               </w:rPr>
-              <w:t xml:space="preserve">System </w:t>
-            </w:r>
-            <w:proofErr w:type="gramStart"/>
-            <w:r>
-              <w:rPr>
-                <w:color w:val="000000"/>
-              </w:rPr>
-              <w:t>show</w:t>
-            </w:r>
-            <w:proofErr w:type="gramEnd"/>
-            <w:r>
-              <w:rPr>
-                <w:color w:val="000000"/>
-              </w:rPr>
-              <w:t xml:space="preserve"> the User Login screen</w:t>
+              <w:t>System show the User Login screen</w:t>
             </w:r>
           </w:p>
           <w:p>
@@ -7845,7 +7766,6 @@
               <w:jc w:val="right"/>
             </w:pPr>
             <w:r>
-              <w:lastRenderedPageBreak/>
               <w:t>Alternative Sequences/Flows</w:t>
             </w:r>
           </w:p>
@@ -7982,21 +7902,7 @@
               <w:rPr>
                 <w:color w:val="000000"/>
               </w:rPr>
-              <w:t xml:space="preserve">Google validates user’s login information successfully and </w:t>
-            </w:r>
-            <w:proofErr w:type="gramStart"/>
-            <w:r>
-              <w:rPr>
-                <w:color w:val="000000"/>
-              </w:rPr>
-              <w:t>redirect</w:t>
-            </w:r>
-            <w:proofErr w:type="gramEnd"/>
-            <w:r>
-              <w:rPr>
-                <w:color w:val="000000"/>
-              </w:rPr>
-              <w:t xml:space="preserve"> him/her back to the system</w:t>
+              <w:t>Google validates user’s login information successfully and redirect him/her back to the system</w:t>
             </w:r>
           </w:p>
           <w:p>
@@ -8128,21 +8034,7 @@
               <w:rPr>
                 <w:color w:val="000000"/>
               </w:rPr>
-              <w:t xml:space="preserve">Input Email/Password are </w:t>
-            </w:r>
-            <w:proofErr w:type="gramStart"/>
-            <w:r>
-              <w:rPr>
-                <w:color w:val="000000"/>
-              </w:rPr>
-              <w:t>correct</w:t>
-            </w:r>
-            <w:proofErr w:type="gramEnd"/>
-            <w:r>
-              <w:rPr>
-                <w:color w:val="000000"/>
-              </w:rPr>
-              <w:t xml:space="preserve"> but email has not been verified (MSG11)</w:t>
+              <w:t>Input Email/Password are correct but email has not been verified (MSG11)</w:t>
             </w:r>
           </w:p>
           <w:p>
@@ -8219,15 +8111,7 @@
         <w:t>2</w:t>
       </w:r>
       <w:r>
-        <w:t xml:space="preserve"> </w:t>
-      </w:r>
-      <w:proofErr w:type="spellStart"/>
-      <w:r>
-        <w:t>Xyz</w:t>
-      </w:r>
-      <w:proofErr w:type="spellEnd"/>
-      <w:r>
-        <w:t xml:space="preserve"> Feature</w:t>
+        <w:t xml:space="preserve"> Xyz Feature</w:t>
       </w:r>
       <w:bookmarkEnd w:id="10"/>
     </w:p>
@@ -8291,28 +8175,12 @@
       <w:r>
         <w:t xml:space="preserve">3.1 </w:t>
       </w:r>
-      <w:proofErr w:type="spellStart"/>
       <w:r>
         <w:rPr>
           <w:lang w:val="vi-VN"/>
         </w:rPr>
-        <w:t>Feature</w:t>
-      </w:r>
-      <w:proofErr w:type="spellEnd"/>
-      <w:r>
-        <w:rPr>
-          <w:lang w:val="vi-VN"/>
-        </w:rPr>
-        <w:t xml:space="preserve"> </w:t>
-      </w:r>
-      <w:proofErr w:type="spellStart"/>
-      <w:r>
-        <w:rPr>
-          <w:lang w:val="vi-VN"/>
-        </w:rPr>
-        <w:t>Name</w:t>
-      </w:r>
-      <w:proofErr w:type="spellEnd"/>
+        <w:t>Feature Name</w:t>
+      </w:r>
       <w:r>
         <w:t>1</w:t>
       </w:r>
@@ -8334,31 +8202,9 @@
         <w:rPr>
           <w:lang w:val="vi-VN"/>
         </w:rPr>
-        <w:t xml:space="preserve">.1 </w:t>
-      </w:r>
-      <w:proofErr w:type="spellStart"/>
-      <w:r>
-        <w:rPr>
-          <w:lang w:val="vi-VN"/>
-        </w:rPr>
-        <w:t>SubFeature</w:t>
-      </w:r>
-      <w:proofErr w:type="spellEnd"/>
-      <w:r>
-        <w:rPr>
-          <w:lang w:val="vi-VN"/>
-        </w:rPr>
-        <w:t xml:space="preserve"> </w:t>
-      </w:r>
-      <w:proofErr w:type="spellStart"/>
-      <w:r>
-        <w:rPr>
-          <w:lang w:val="vi-VN"/>
-        </w:rPr>
-        <w:t>Name</w:t>
+        <w:t>.1 SubFeature Name</w:t>
       </w:r>
       <w:bookmarkEnd w:id="18"/>
-      <w:proofErr w:type="spellEnd"/>
       <w:r>
         <w:t>1.1</w:t>
       </w:r>
@@ -8372,14 +8218,12 @@
       <w:r>
         <w:t xml:space="preserve">3.1.1.1 </w:t>
       </w:r>
-      <w:proofErr w:type="spellStart"/>
       <w:r>
         <w:rPr>
           <w:lang w:val="vi-VN"/>
         </w:rPr>
         <w:t>Screen</w:t>
       </w:r>
-      <w:proofErr w:type="spellEnd"/>
       <w:r>
         <w:t>/Function</w:t>
       </w:r>
@@ -8387,16 +8231,8 @@
         <w:rPr>
           <w:lang w:val="vi-VN"/>
         </w:rPr>
-        <w:t xml:space="preserve"> </w:t>
-      </w:r>
-      <w:proofErr w:type="spellStart"/>
-      <w:r>
-        <w:rPr>
-          <w:lang w:val="vi-VN"/>
-        </w:rPr>
-        <w:t>Name</w:t>
-      </w:r>
-      <w:proofErr w:type="spellEnd"/>
+        <w:t xml:space="preserve"> Name</w:t>
+      </w:r>
       <w:r>
         <w:t>1</w:t>
       </w:r>
@@ -8429,23 +8265,7 @@
           <w:i/>
           <w:color w:val="0000FF"/>
         </w:rPr>
-        <w:t>UI layout (</w:t>
-      </w:r>
-      <w:proofErr w:type="spellStart"/>
-      <w:r>
-        <w:rPr>
-          <w:i/>
-          <w:color w:val="0000FF"/>
-        </w:rPr>
-        <w:t>Mockup</w:t>
-      </w:r>
-      <w:proofErr w:type="spellEnd"/>
-      <w:r>
-        <w:rPr>
-          <w:i/>
-          <w:color w:val="0000FF"/>
-        </w:rPr>
-        <w:t xml:space="preserve"> </w:t>
+        <w:t xml:space="preserve">UI layout (Mockup </w:t>
       </w:r>
       <w:r>
         <w:rPr>
@@ -8817,30 +8637,8 @@
         <w:rPr>
           <w:lang w:val="vi-VN"/>
         </w:rPr>
-        <w:t xml:space="preserve"> </w:t>
-      </w:r>
-      <w:proofErr w:type="spellStart"/>
-      <w:r>
-        <w:rPr>
-          <w:lang w:val="vi-VN"/>
-        </w:rPr>
-        <w:t>SubFeature</w:t>
-      </w:r>
-      <w:proofErr w:type="spellEnd"/>
-      <w:r>
-        <w:rPr>
-          <w:lang w:val="vi-VN"/>
-        </w:rPr>
-        <w:t xml:space="preserve"> </w:t>
-      </w:r>
-      <w:proofErr w:type="spellStart"/>
-      <w:r>
-        <w:rPr>
-          <w:lang w:val="vi-VN"/>
-        </w:rPr>
-        <w:t>Name</w:t>
-      </w:r>
-      <w:proofErr w:type="spellEnd"/>
+        <w:t xml:space="preserve"> SubFeature Name</w:t>
+      </w:r>
       <w:r>
         <w:t>1.2</w:t>
       </w:r>
@@ -8902,32 +8700,10 @@
         <w:rPr>
           <w:lang w:val="vi-VN"/>
         </w:rPr>
-        <w:t xml:space="preserve"> </w:t>
-      </w:r>
-      <w:proofErr w:type="spellStart"/>
-      <w:r>
-        <w:rPr>
-          <w:lang w:val="vi-VN"/>
-        </w:rPr>
-        <w:t>User</w:t>
-      </w:r>
-      <w:proofErr w:type="spellEnd"/>
-      <w:r>
-        <w:rPr>
-          <w:lang w:val="vi-VN"/>
-        </w:rPr>
-        <w:t xml:space="preserve"> </w:t>
-      </w:r>
-      <w:proofErr w:type="spellStart"/>
-      <w:r>
-        <w:rPr>
-          <w:lang w:val="vi-VN"/>
-        </w:rPr>
-        <w:t>Login</w:t>
+        <w:t xml:space="preserve"> User Login</w:t>
       </w:r>
       <w:bookmarkEnd w:id="29"/>
       <w:bookmarkEnd w:id="30"/>
-      <w:proofErr w:type="spellEnd"/>
     </w:p>
     <w:p>
       <w:r>
@@ -9565,15 +9341,7 @@
           </w:tcPr>
           <w:p>
             <w:r>
-              <w:t xml:space="preserve">The change-status action is Activate or Deactivate depending on the </w:t>
-            </w:r>
-            <w:proofErr w:type="gramStart"/>
-            <w:r>
-              <w:t>current status</w:t>
-            </w:r>
-            <w:proofErr w:type="gramEnd"/>
-            <w:r>
-              <w:t xml:space="preserve"> of the relevant setting (Inactive or Active, respectively).</w:t>
+              <w:t>The change-status action is Activate or Deactivate depending on the current status of the relevant setting (Inactive or Active, respectively).</w:t>
             </w:r>
           </w:p>
         </w:tc>
@@ -9996,23 +9764,7 @@
           <w:i/>
           <w:color w:val="0000FF"/>
         </w:rPr>
-        <w:t xml:space="preserve">[This section includes all those requirements that affect usability. For example, specify the required training time for a normal user and a power user to become productive at </w:t>
-      </w:r>
-      <w:proofErr w:type="gramStart"/>
-      <w:r>
-        <w:rPr>
-          <w:i/>
-          <w:color w:val="0000FF"/>
-        </w:rPr>
-        <w:t>particular operations</w:t>
-      </w:r>
-      <w:proofErr w:type="gramEnd"/>
-      <w:r>
-        <w:rPr>
-          <w:i/>
-          <w:color w:val="0000FF"/>
-        </w:rPr>
-        <w:t xml:space="preserve"> specify measurable task times for typical tasks or base the new system’s usability requirements on other systems that the users know and like specify requirement to conform to common usability standards, such as IBM’s CUA standards Microsoft’s GUI standards]</w:t>
+        <w:t>[This section includes all those requirements that affect usability. For example, specify the required training time for a normal user and a power user to become productive at particular operations specify measurable task times for typical tasks or base the new system’s usability requirements on other systems that the users know and like specify requirement to conform to common usability standards, such as IBM’s CUA standards Microsoft’s GUI standards]</w:t>
       </w:r>
     </w:p>
     <w:p>
@@ -11581,19 +11333,118 @@
                 <w:sz w:val="22"/>
                 <w:szCs w:val="22"/>
               </w:rPr>
-              <w:t>A confirmation email has been sent to {</w:t>
-            </w:r>
-            <w:proofErr w:type="spellStart"/>
-            <w:r>
+              <w:t xml:space="preserve">A confirmation email has been sent to {email_address}. </w:t>
+            </w:r>
+          </w:p>
+        </w:tc>
+      </w:tr>
+      <w:tr>
+        <w:tc>
+          <w:tcPr>
+            <w:tcW w:w="557" w:type="dxa"/>
+          </w:tcPr>
+          <w:p>
+            <w:pPr>
+              <w:spacing w:before="60" w:after="60"/>
+              <w:rPr>
+                <w:rFonts w:asciiTheme="minorHAnsi" w:hAnsiTheme="minorHAnsi" w:cstheme="minorHAnsi"/>
+                <w:sz w:val="22"/>
+                <w:szCs w:val="22"/>
+              </w:rPr>
+            </w:pPr>
+            <w:r>
+              <w:rPr>
+                <w:rFonts w:asciiTheme="minorHAnsi" w:hAnsiTheme="minorHAnsi" w:cstheme="minorHAnsi"/>
+                <w:sz w:val="22"/>
+                <w:szCs w:val="22"/>
+              </w:rPr>
+              <w:t>6</w:t>
+            </w:r>
+          </w:p>
+        </w:tc>
+        <w:tc>
+          <w:tcPr>
+            <w:tcW w:w="1122" w:type="dxa"/>
+          </w:tcPr>
+          <w:p>
+            <w:pPr>
+              <w:spacing w:before="60" w:after="60"/>
+              <w:rPr>
+                <w:rFonts w:asciiTheme="minorHAnsi" w:hAnsiTheme="minorHAnsi" w:cstheme="minorHAnsi"/>
+                <w:sz w:val="22"/>
+                <w:szCs w:val="22"/>
+              </w:rPr>
+            </w:pPr>
+            <w:r>
+              <w:rPr>
+                <w:rFonts w:asciiTheme="minorHAnsi" w:hAnsiTheme="minorHAnsi" w:cstheme="minorHAnsi"/>
+                <w:sz w:val="22"/>
+                <w:szCs w:val="22"/>
+              </w:rPr>
+              <w:t>MSG06</w:t>
+            </w:r>
+          </w:p>
+        </w:tc>
+        <w:tc>
+          <w:tcPr>
+            <w:tcW w:w="1466" w:type="dxa"/>
+          </w:tcPr>
+          <w:p>
+            <w:pPr>
+              <w:spacing w:before="60" w:after="60"/>
+              <w:rPr>
+                <w:rFonts w:asciiTheme="minorHAnsi" w:hAnsiTheme="minorHAnsi" w:cstheme="minorHAnsi"/>
+                <w:sz w:val="22"/>
+                <w:szCs w:val="22"/>
+              </w:rPr>
+            </w:pPr>
+            <w:r>
+              <w:rPr>
+                <w:rFonts w:asciiTheme="minorHAnsi" w:hAnsiTheme="minorHAnsi" w:cstheme="minorHAnsi"/>
+                <w:sz w:val="22"/>
+                <w:szCs w:val="22"/>
+              </w:rPr>
+              <w:t>Toast message</w:t>
+            </w:r>
+          </w:p>
+        </w:tc>
+        <w:tc>
+          <w:tcPr>
+            <w:tcW w:w="3038" w:type="dxa"/>
+          </w:tcPr>
+          <w:p>
+            <w:pPr>
+              <w:spacing w:before="60" w:after="60"/>
+              <w:rPr>
+                <w:rFonts w:asciiTheme="minorHAnsi" w:hAnsiTheme="minorHAnsi" w:cstheme="minorHAnsi"/>
+                <w:sz w:val="22"/>
+                <w:szCs w:val="22"/>
+              </w:rPr>
+            </w:pPr>
+            <w:r>
+              <w:rPr>
+                <w:rFonts w:asciiTheme="minorHAnsi" w:hAnsiTheme="minorHAnsi" w:cstheme="minorHAnsi"/>
+                <w:sz w:val="22"/>
+                <w:szCs w:val="22"/>
+              </w:rPr>
+              <w:t>Resetting asset information successfully</w:t>
+            </w:r>
+          </w:p>
+        </w:tc>
+        <w:tc>
+          <w:tcPr>
+            <w:tcW w:w="2964" w:type="dxa"/>
+          </w:tcPr>
+          <w:p>
+            <w:pPr>
+              <w:spacing w:before="60" w:after="60"/>
               <w:rPr>
                 <w:rFonts w:asciiTheme="minorHAnsi" w:hAnsiTheme="minorHAnsi" w:cstheme="minorHAnsi"/>
                 <w:i/>
                 <w:sz w:val="22"/>
                 <w:szCs w:val="22"/>
               </w:rPr>
-              <w:t>email_address</w:t>
-            </w:r>
-            <w:proofErr w:type="spellEnd"/>
+            </w:pPr>
             <w:r>
               <w:rPr>
                 <w:rFonts w:asciiTheme="minorHAnsi" w:hAnsiTheme="minorHAnsi" w:cstheme="minorHAnsi"/>
@@ -11601,7 +11452,7 @@
                 <w:sz w:val="22"/>
                 <w:szCs w:val="22"/>
               </w:rPr>
-              <w:t xml:space="preserve">}. </w:t>
+              <w:t xml:space="preserve">Return asset(s) successfully. </w:t>
             </w:r>
           </w:p>
         </w:tc>
@@ -11626,7 +11477,7 @@
                 <w:sz w:val="22"/>
                 <w:szCs w:val="22"/>
               </w:rPr>
-              <w:t>6</w:t>
+              <w:t>7</w:t>
             </w:r>
           </w:p>
         </w:tc>
@@ -11649,7 +11500,7 @@
                 <w:sz w:val="22"/>
                 <w:szCs w:val="22"/>
               </w:rPr>
-              <w:t>MSG06</w:t>
+              <w:t>MSG07</w:t>
             </w:r>
           </w:p>
         </w:tc>
@@ -11695,7 +11546,7 @@
                 <w:sz w:val="22"/>
                 <w:szCs w:val="22"/>
               </w:rPr>
-              <w:t>Resetting asset information successfully</w:t>
+              <w:t>Deleting asset information successfully</w:t>
             </w:r>
           </w:p>
         </w:tc>
@@ -11720,7 +11571,7 @@
                 <w:sz w:val="22"/>
                 <w:szCs w:val="22"/>
               </w:rPr>
-              <w:t xml:space="preserve">Return asset(s) successfully. </w:t>
+              <w:t xml:space="preserve">Delete asset(s) successfully. </w:t>
             </w:r>
           </w:p>
         </w:tc>
@@ -11745,7 +11596,8 @@
                 <w:sz w:val="22"/>
                 <w:szCs w:val="22"/>
               </w:rPr>
-              <w:t>7</w:t>
+              <w:lastRenderedPageBreak/>
+              <w:t>8</w:t>
             </w:r>
           </w:p>
         </w:tc>
@@ -11768,7 +11620,7 @@
                 <w:sz w:val="22"/>
                 <w:szCs w:val="22"/>
               </w:rPr>
-              <w:t>MSG07</w:t>
+              <w:t>MSG08</w:t>
             </w:r>
           </w:p>
         </w:tc>
@@ -11791,7 +11643,7 @@
                 <w:sz w:val="22"/>
                 <w:szCs w:val="22"/>
               </w:rPr>
-              <w:t>Toast message</w:t>
+              <w:t>In red, under the text box</w:t>
             </w:r>
           </w:p>
         </w:tc>
@@ -11814,7 +11666,7 @@
                 <w:sz w:val="22"/>
                 <w:szCs w:val="22"/>
               </w:rPr>
-              <w:t>Deleting asset information successfully</w:t>
+              <w:t>Input value length &gt; max length</w:t>
             </w:r>
           </w:p>
         </w:tc>
@@ -11839,7 +11691,7 @@
                 <w:sz w:val="22"/>
                 <w:szCs w:val="22"/>
               </w:rPr>
-              <w:t xml:space="preserve">Delete asset(s) successfully. </w:t>
+              <w:t xml:space="preserve">Exceed max length of {max_length}. </w:t>
             </w:r>
           </w:p>
         </w:tc>
@@ -11864,8 +11716,7 @@
                 <w:sz w:val="22"/>
                 <w:szCs w:val="22"/>
               </w:rPr>
-              <w:lastRenderedPageBreak/>
-              <w:t>8</w:t>
+              <w:t>9</w:t>
             </w:r>
           </w:p>
         </w:tc>
@@ -11888,7 +11739,7 @@
                 <w:sz w:val="22"/>
                 <w:szCs w:val="22"/>
               </w:rPr>
-              <w:t>MSG08</w:t>
+              <w:t>MSG09</w:t>
             </w:r>
           </w:p>
         </w:tc>
@@ -11911,7 +11762,7 @@
                 <w:sz w:val="22"/>
                 <w:szCs w:val="22"/>
               </w:rPr>
-              <w:t>In red, under the text box</w:t>
+              <w:t>In line</w:t>
             </w:r>
           </w:p>
         </w:tc>
@@ -11934,7 +11785,7 @@
                 <w:sz w:val="22"/>
                 <w:szCs w:val="22"/>
               </w:rPr>
-              <w:t>Input value length &gt; max length</w:t>
+              <w:t>Username or password is not correct when clicking sign-in</w:t>
             </w:r>
           </w:p>
         </w:tc>
@@ -11959,177 +11810,7 @@
                 <w:sz w:val="22"/>
                 <w:szCs w:val="22"/>
               </w:rPr>
-              <w:t>Exceed max length of {</w:t>
-            </w:r>
-            <w:proofErr w:type="spellStart"/>
-            <w:r>
-              <w:rPr>
-                <w:rFonts w:asciiTheme="minorHAnsi" w:hAnsiTheme="minorHAnsi" w:cstheme="minorHAnsi"/>
-                <w:i/>
-                <w:sz w:val="22"/>
-                <w:szCs w:val="22"/>
-              </w:rPr>
-              <w:t>max_length</w:t>
-            </w:r>
-            <w:proofErr w:type="spellEnd"/>
-            <w:r>
-              <w:rPr>
-                <w:rFonts w:asciiTheme="minorHAnsi" w:hAnsiTheme="minorHAnsi" w:cstheme="minorHAnsi"/>
-                <w:i/>
-                <w:sz w:val="22"/>
-                <w:szCs w:val="22"/>
-              </w:rPr>
-              <w:t xml:space="preserve">}. </w:t>
-            </w:r>
-          </w:p>
-        </w:tc>
-      </w:tr>
-      <w:tr>
-        <w:tc>
-          <w:tcPr>
-            <w:tcW w:w="557" w:type="dxa"/>
-          </w:tcPr>
-          <w:p>
-            <w:pPr>
-              <w:spacing w:before="60" w:after="60"/>
-              <w:rPr>
-                <w:rFonts w:asciiTheme="minorHAnsi" w:hAnsiTheme="minorHAnsi" w:cstheme="minorHAnsi"/>
-                <w:sz w:val="22"/>
-                <w:szCs w:val="22"/>
-              </w:rPr>
-            </w:pPr>
-            <w:r>
-              <w:rPr>
-                <w:rFonts w:asciiTheme="minorHAnsi" w:hAnsiTheme="minorHAnsi" w:cstheme="minorHAnsi"/>
-                <w:sz w:val="22"/>
-                <w:szCs w:val="22"/>
-              </w:rPr>
-              <w:t>9</w:t>
-            </w:r>
-          </w:p>
-        </w:tc>
-        <w:tc>
-          <w:tcPr>
-            <w:tcW w:w="1122" w:type="dxa"/>
-          </w:tcPr>
-          <w:p>
-            <w:pPr>
-              <w:spacing w:before="60" w:after="60"/>
-              <w:rPr>
-                <w:rFonts w:asciiTheme="minorHAnsi" w:hAnsiTheme="minorHAnsi" w:cstheme="minorHAnsi"/>
-                <w:sz w:val="22"/>
-                <w:szCs w:val="22"/>
-              </w:rPr>
-            </w:pPr>
-            <w:r>
-              <w:rPr>
-                <w:rFonts w:asciiTheme="minorHAnsi" w:hAnsiTheme="minorHAnsi" w:cstheme="minorHAnsi"/>
-                <w:sz w:val="22"/>
-                <w:szCs w:val="22"/>
-              </w:rPr>
-              <w:t>MSG09</w:t>
-            </w:r>
-          </w:p>
-        </w:tc>
-        <w:tc>
-          <w:tcPr>
-            <w:tcW w:w="1466" w:type="dxa"/>
-          </w:tcPr>
-          <w:p>
-            <w:pPr>
-              <w:spacing w:before="60" w:after="60"/>
-              <w:rPr>
-                <w:rFonts w:asciiTheme="minorHAnsi" w:hAnsiTheme="minorHAnsi" w:cstheme="minorHAnsi"/>
-                <w:sz w:val="22"/>
-                <w:szCs w:val="22"/>
-              </w:rPr>
-            </w:pPr>
-            <w:r>
-              <w:rPr>
-                <w:rFonts w:asciiTheme="minorHAnsi" w:hAnsiTheme="minorHAnsi" w:cstheme="minorHAnsi"/>
-                <w:sz w:val="22"/>
-                <w:szCs w:val="22"/>
-              </w:rPr>
-              <w:t>In line</w:t>
-            </w:r>
-          </w:p>
-        </w:tc>
-        <w:tc>
-          <w:tcPr>
-            <w:tcW w:w="3038" w:type="dxa"/>
-          </w:tcPr>
-          <w:p>
-            <w:pPr>
-              <w:spacing w:before="60" w:after="60"/>
-              <w:rPr>
-                <w:rFonts w:asciiTheme="minorHAnsi" w:hAnsiTheme="minorHAnsi" w:cstheme="minorHAnsi"/>
-                <w:sz w:val="22"/>
-                <w:szCs w:val="22"/>
-              </w:rPr>
-            </w:pPr>
-            <w:r>
-              <w:rPr>
-                <w:rFonts w:asciiTheme="minorHAnsi" w:hAnsiTheme="minorHAnsi" w:cstheme="minorHAnsi"/>
-                <w:sz w:val="22"/>
-                <w:szCs w:val="22"/>
-              </w:rPr>
-              <w:t>Username or password is not correct when clicking sign-in</w:t>
-            </w:r>
-          </w:p>
-        </w:tc>
-        <w:tc>
-          <w:tcPr>
-            <w:tcW w:w="2964" w:type="dxa"/>
-          </w:tcPr>
-          <w:p>
-            <w:pPr>
-              <w:spacing w:before="60" w:after="60"/>
-              <w:rPr>
-                <w:rFonts w:asciiTheme="minorHAnsi" w:hAnsiTheme="minorHAnsi" w:cstheme="minorHAnsi"/>
-                <w:i/>
-                <w:sz w:val="22"/>
-                <w:szCs w:val="22"/>
-              </w:rPr>
-            </w:pPr>
-            <w:proofErr w:type="spellStart"/>
-            <w:r>
-              <w:rPr>
-                <w:rFonts w:asciiTheme="minorHAnsi" w:hAnsiTheme="minorHAnsi" w:cstheme="minorHAnsi"/>
-                <w:i/>
-                <w:sz w:val="22"/>
-                <w:szCs w:val="22"/>
-              </w:rPr>
-              <w:t>Incorrrect</w:t>
-            </w:r>
-            <w:proofErr w:type="spellEnd"/>
-            <w:r>
-              <w:rPr>
-                <w:rFonts w:asciiTheme="minorHAnsi" w:hAnsiTheme="minorHAnsi" w:cstheme="minorHAnsi"/>
-                <w:i/>
-                <w:sz w:val="22"/>
-                <w:szCs w:val="22"/>
-              </w:rPr>
-              <w:t xml:space="preserve"> </w:t>
-            </w:r>
-            <w:proofErr w:type="gramStart"/>
-            <w:r>
-              <w:rPr>
-                <w:rFonts w:asciiTheme="minorHAnsi" w:hAnsiTheme="minorHAnsi" w:cstheme="minorHAnsi"/>
-                <w:i/>
-                <w:sz w:val="22"/>
-                <w:szCs w:val="22"/>
-              </w:rPr>
-              <w:t>user name</w:t>
-            </w:r>
-            <w:proofErr w:type="gramEnd"/>
-            <w:r>
-              <w:rPr>
-                <w:rFonts w:asciiTheme="minorHAnsi" w:hAnsiTheme="minorHAnsi" w:cstheme="minorHAnsi"/>
-                <w:i/>
-                <w:sz w:val="22"/>
-                <w:szCs w:val="22"/>
-              </w:rPr>
-              <w:t xml:space="preserve"> or password. Please check again.</w:t>
+              <w:t>Incorrrect user name or password. Please check again.</w:t>
             </w:r>
           </w:p>
         </w:tc>
@@ -12344,7 +12025,6 @@
               <w:szCs w:val="22"/>
             </w:rPr>
           </w:pPr>
-          <w:proofErr w:type="spellStart"/>
           <w:r>
             <w:rPr>
               <w:rFonts w:ascii="Calibri" w:eastAsia="Calibri" w:hAnsi="Calibri" w:cs="Calibri"/>
@@ -12352,17 +12032,7 @@
               <w:sz w:val="22"/>
               <w:szCs w:val="22"/>
             </w:rPr>
-            <w:t>ProjectCode</w:t>
-          </w:r>
-          <w:proofErr w:type="spellEnd"/>
-          <w:r>
-            <w:rPr>
-              <w:rFonts w:ascii="Calibri" w:eastAsia="Calibri" w:hAnsi="Calibri" w:cs="Calibri"/>
-              <w:color w:val="000000"/>
-              <w:sz w:val="22"/>
-              <w:szCs w:val="22"/>
-            </w:rPr>
-            <w:t xml:space="preserve"> – Report 3 (SRS Document)</w:t>
+            <w:t>ProjectCode – Report 3 (SRS Document)</w:t>
           </w:r>
         </w:p>
       </w:tc>

</xml_diff>